<commit_message>
Remove the charged-not-convicted paragraph
Dropped at the author's direction. The piece's argument does not turn
on whether the officer is guilty, so the procedural posture is beside
the point. The text still says she was charged and still frames the
registry consequence as conditional on a conviction.

Co-Authored-By: Claude Opus 5 <noreply@anthropic.com>
Claude-Session: https://claude.ai/code/session_01Pk1A5UusdgnU9bEu3BZJo4
</commit_message>
<xml_diff>
--- a/content/substack/fort-dix-officer-consensual-category.docx
+++ b/content/substack/fort-dix-officer-consensual-category.docx
@@ -168,11 +168,6 @@
       </w:r>
       <w:r>
         <w:t>. She did not force anybody. She was a young, good-looking woman working twelve-hour shifts in a building with three hundred forty men and one officer. What did you think was going to happen?</w:t>
-      </w:r>
-    </w:p>
-    <w:p>
-      <w:r>
-        <w:t>She is charged, not convicted — by complaint, no indictment, out on bond. All of it remains allegation.</w:t>
       </w:r>
     </w:p>
     <w:p>

</xml_diff>

<commit_message>
Correct three factual and framing errors
The inmate was taken to the SHU, not merely removed from the
compound; this also sharpens the asymmetry against the officer's paid
administrative leave. An officer in the gym would be supervising, not
breaking up a game. The victimization-risk housing unit is described
directly rather than by negating a claim no reader would have made.

Co-Authored-By: Claude Opus 5 <noreply@anthropic.com>
Claude-Session: https://claude.ai/code/session_01Pk1A5UusdgnU9bEu3BZJo4
</commit_message>
<xml_diff>
--- a/content/substack/fort-dix-officer-consensual-category.docx
+++ b/content/substack/fort-dix-officer-consensual-category.docx
@@ -104,7 +104,7 @@
     </w:p>
     <w:p>
       <w:r>
-        <w:t>Not to break it up. To play. A housing unit officer stepped onto the court in the gym at FCI Fort Dix, picked up a paddle, and hit the ball back and forth with us while she vaped.</w:t>
+        <w:t>Not to supervise. To play. A housing unit officer stepped onto the court in the gym at FCI Fort Dix, picked up a paddle, and hit the ball back and forth with us while she vaped.</w:t>
       </w:r>
     </w:p>
     <w:p>
@@ -136,7 +136,7 @@
     </w:p>
     <w:p>
       <w:r>
-        <w:t>Then he came off the compound. Months later she was moved outside the perimeter, then brought back inside, and we figured nobody had snitched and the investigation had cleared her. Then she went out again. A few weeks later she was charged.</w:t>
+        <w:t>Then he was taken to the SHU. Months later she was moved outside the perimeter, then brought back inside, and we figured nobody had snitched and the investigation had cleared her. Then she went out again. A few weeks later she was charged.</w:t>
       </w:r>
     </w:p>
     <w:p>
@@ -221,7 +221,7 @@
     </w:p>
     <w:p>
       <w:r>
-        <w:t>He went to a unit designated for men at high risk of victimization. That is not a sex offender unit, but it fills with them, because they are the ones flagged as vulnerable — most will not fight to defend themselves. The only men it keeps out are those flagged as risks to perpetrate.</w:t>
+        <w:t>He went to a unit designated for men at high risk of victimization, which in practice means a unit heavy with sex offenders. They are the ones flagged as vulnerable, because most will not fight to defend themselves.</w:t>
       </w:r>
     </w:p>
     <w:p>
@@ -253,7 +253,7 @@
     </w:p>
     <w:p>
       <w:r>
-        <w:t>He came off the compound months before anyone knew why. She went on paid administrative leave and came back inside the perimeter for a while. Federal data bears the pattern out — in substantiated staff misconduct cases, sixteen percent of the men the law calls victims end up in segregation, eleven percent transferred.</w:t>
+        <w:t>He went to the SHU months before anyone knew why. She went on paid administrative leave and came back inside the perimeter for a while. Federal data bears the pattern out — in substantiated staff misconduct cases, sixteen percent of the men the law calls victims end up in segregation, eleven percent transferred.</w:t>
       </w:r>
     </w:p>
     <w:p>

</xml_diff>

<commit_message>
Fix the timeline and state the limits of what the author witnessed
Everything the author saw firsthand predates his June 2025 transfer
out of Fort Dix, months before the conduct the government actually
charged. Saying so is more accurate and makes the point stronger: the
behavior was visible long before the case existed.

Co-Authored-By: Claude Opus 5 <noreply@anthropic.com>
Claude-Session: https://claude.ai/code/session_01Pk1A5UusdgnU9bEu3BZJo4
</commit_message>
<xml_diff>
--- a/content/substack/fort-dix-officer-consensual-category.docx
+++ b/content/substack/fort-dix-officer-consensual-category.docx
@@ -136,7 +136,12 @@
     </w:p>
     <w:p>
       <w:r>
-        <w:t>Then he was taken to the SHU. Months later she was moved outside the perimeter, then brought back inside, and we figured nobody had snitched and the investigation had cleared her. Then she went out again. A few weeks later she was charged.</w:t>
+        <w:t>I saw all of that before June 2025, when I was transferred out of Fort Dix for four months. The sex the government actually charged happened in January 2026, and the phones that made its case were seized months before that. This had been going on a long time.</w:t>
+      </w:r>
+    </w:p>
+    <w:p>
+      <w:r>
+        <w:t>Then he was taken to the SHU. She was moved outside the perimeter, then brought back inside, and we figured nobody had snitched and the investigation had cleared her. Then she went out again. A few weeks later she was charged.</w:t>
       </w:r>
     </w:p>
     <w:p>

</xml_diff>